<commit_message>
Week 8 rich task handout: full, clickable URLs for all four task sources
Co-Authored-By: Claude Opus 5.5 <noreply@anthropic.com>
</commit_message>
<xml_diff>
--- a/week-8-rich-tasks/week-8-rich-task.docx
+++ b/week-8-rich-tasks/week-8-rich-task.docx
@@ -604,7 +604,182 @@
           <w:sz w:val="21"/>
           <w:szCs w:val="21"/>
         </w:rPr>
-        <w:t xml:space="preserve"> NRICH, YouCubed, Van de Walle, or an article on JSTOR. No Teachers Pay Teachers or other sites. (If you have a research partner, find one task together.) Be ready to pose it in the clinic.</w:t>
+        <w:br/>
+      </w:r>
+      <w:r>
+        <w:rPr>
+          <w:rFonts w:eastAsia="ＭＳ 明朝" w:cs="Calibri" w:ascii="Clear Sans" w:hAnsi="Clear Sans"/>
+          <w:color w:val="1F2933"/>
+          <w:kern w:val="0"/>
+          <w:sz w:val="21"/>
+          <w:szCs w:val="21"/>
+        </w:rPr>
+        <w:t xml:space="preserve">NRICH: </w:t>
+      </w:r>
+      <w:hyperlink r:id="rId100">
+        <w:r>
+          <w:rPr>
+            <w:rFonts w:eastAsia="ＭＳ 明朝" w:cs="Calibri" w:ascii="Clear Sans" w:hAnsi="Clear Sans"/>
+            <w:color w:val="0563C1"/>
+            <w:kern w:val="0"/>
+            <w:sz w:val="21"/>
+            <w:szCs w:val="21"/>
+            <w:u w:val="single"/>
+          </w:rPr>
+          <w:t>https://nrich.maths.org/curriculum-linked-problems-primary-teachers</w:t>
+        </w:r>
+      </w:hyperlink>
+      <w:r>
+        <w:rPr>
+          <w:rFonts w:eastAsia="ＭＳ 明朝" w:cs="Calibri" w:ascii="Clear Sans" w:hAnsi="Clear Sans"/>
+          <w:color w:val="1F2933"/>
+          <w:kern w:val="0"/>
+          <w:sz w:val="21"/>
+          <w:szCs w:val="21"/>
+        </w:rPr>
+        <w:br/>
+      </w:r>
+      <w:r>
+        <w:rPr>
+          <w:rFonts w:eastAsia="ＭＳ 明朝" w:cs="Calibri" w:ascii="Clear Sans" w:hAnsi="Clear Sans"/>
+          <w:color w:val="1F2933"/>
+          <w:kern w:val="0"/>
+          <w:sz w:val="21"/>
+          <w:szCs w:val="21"/>
+        </w:rPr>
+        <w:t xml:space="preserve">YouCubed: </w:t>
+      </w:r>
+      <w:hyperlink r:id="rId101">
+        <w:r>
+          <w:rPr>
+            <w:rFonts w:eastAsia="ＭＳ 明朝" w:cs="Calibri" w:ascii="Clear Sans" w:hAnsi="Clear Sans"/>
+            <w:color w:val="0563C1"/>
+            <w:kern w:val="0"/>
+            <w:sz w:val="21"/>
+            <w:szCs w:val="21"/>
+            <w:u w:val="single"/>
+          </w:rPr>
+          <w:t>https://www.youcubed.org/tasks/</w:t>
+        </w:r>
+      </w:hyperlink>
+      <w:r>
+        <w:rPr>
+          <w:rFonts w:eastAsia="ＭＳ 明朝" w:cs="Calibri" w:ascii="Clear Sans" w:hAnsi="Clear Sans"/>
+          <w:color w:val="1F2933"/>
+          <w:kern w:val="0"/>
+          <w:sz w:val="21"/>
+          <w:szCs w:val="21"/>
+        </w:rPr>
+        <w:br/>
+      </w:r>
+      <w:r>
+        <w:rPr>
+          <w:rFonts w:eastAsia="ＭＳ 明朝" w:cs="Calibri" w:ascii="Clear Sans" w:hAnsi="Clear Sans"/>
+          <w:color w:val="1F2933"/>
+          <w:kern w:val="0"/>
+          <w:sz w:val="21"/>
+          <w:szCs w:val="21"/>
+        </w:rPr>
+        <w:t xml:space="preserve">Van de Walle, chapters 3 and 4 in Canvas (Hamilton): </w:t>
+      </w:r>
+      <w:hyperlink r:id="rId102">
+        <w:r>
+          <w:rPr>
+            <w:rFonts w:eastAsia="ＭＳ 明朝" w:cs="Calibri" w:ascii="Clear Sans" w:hAnsi="Clear Sans"/>
+            <w:color w:val="0563C1"/>
+            <w:kern w:val="0"/>
+            <w:sz w:val="21"/>
+            <w:szCs w:val="21"/>
+            <w:u w:val="single"/>
+          </w:rPr>
+          <w:t>https://miamioh.instructure.com/courses/258364/files/folder/van%20de%20Walle%20Readings</w:t>
+        </w:r>
+      </w:hyperlink>
+      <w:r>
+        <w:rPr>
+          <w:rFonts w:eastAsia="ＭＳ 明朝" w:cs="Calibri" w:ascii="Clear Sans" w:hAnsi="Clear Sans"/>
+          <w:color w:val="1F2933"/>
+          <w:kern w:val="0"/>
+          <w:sz w:val="21"/>
+          <w:szCs w:val="21"/>
+        </w:rPr>
+        <w:br/>
+      </w:r>
+      <w:r>
+        <w:rPr>
+          <w:rFonts w:eastAsia="ＭＳ 明朝" w:cs="Calibri" w:ascii="Clear Sans" w:hAnsi="Clear Sans"/>
+          <w:color w:val="1F2933"/>
+          <w:kern w:val="0"/>
+          <w:sz w:val="21"/>
+          <w:szCs w:val="21"/>
+        </w:rPr>
+        <w:t xml:space="preserve">Van de Walle, chapters 3 and 4 in Canvas (Oxford): </w:t>
+      </w:r>
+      <w:hyperlink r:id="rId103">
+        <w:r>
+          <w:rPr>
+            <w:rFonts w:eastAsia="ＭＳ 明朝" w:cs="Calibri" w:ascii="Clear Sans" w:hAnsi="Clear Sans"/>
+            <w:color w:val="0563C1"/>
+            <w:kern w:val="0"/>
+            <w:sz w:val="21"/>
+            <w:szCs w:val="21"/>
+            <w:u w:val="single"/>
+          </w:rPr>
+          <w:t>https://miamioh.instructure.com/courses/258372/files/folder/van%20de%20Walle%20Readings</w:t>
+        </w:r>
+      </w:hyperlink>
+      <w:r>
+        <w:rPr>
+          <w:rFonts w:eastAsia="ＭＳ 明朝" w:cs="Calibri" w:ascii="Clear Sans" w:hAnsi="Clear Sans"/>
+          <w:color w:val="1F2933"/>
+          <w:kern w:val="0"/>
+          <w:sz w:val="21"/>
+          <w:szCs w:val="21"/>
+        </w:rPr>
+        <w:br/>
+      </w:r>
+      <w:r>
+        <w:rPr>
+          <w:rFonts w:eastAsia="ＭＳ 明朝" w:cs="Calibri" w:ascii="Clear Sans" w:hAnsi="Clear Sans"/>
+          <w:color w:val="1F2933"/>
+          <w:kern w:val="0"/>
+          <w:sz w:val="21"/>
+          <w:szCs w:val="21"/>
+        </w:rPr>
+        <w:t xml:space="preserve">JSTOR, articles from journals like Teaching Children Mathematics: </w:t>
+      </w:r>
+      <w:hyperlink r:id="rId104">
+        <w:r>
+          <w:rPr>
+            <w:rFonts w:eastAsia="ＭＳ 明朝" w:cs="Calibri" w:ascii="Clear Sans" w:hAnsi="Clear Sans"/>
+            <w:color w:val="0563C1"/>
+            <w:kern w:val="0"/>
+            <w:sz w:val="21"/>
+            <w:szCs w:val="21"/>
+            <w:u w:val="single"/>
+          </w:rPr>
+          <w:t>https://www.jstor.org/</w:t>
+        </w:r>
+      </w:hyperlink>
+      <w:r>
+        <w:rPr>
+          <w:rFonts w:eastAsia="ＭＳ 明朝" w:cs="Calibri" w:ascii="Clear Sans" w:hAnsi="Clear Sans"/>
+          <w:color w:val="1F2933"/>
+          <w:kern w:val="0"/>
+          <w:sz w:val="21"/>
+          <w:szCs w:val="21"/>
+        </w:rPr>
+        <w:br/>
+      </w:r>
+      <w:r>
+        <w:rPr>
+          <w:rFonts w:eastAsia="ＭＳ 明朝" w:cs="Calibri" w:ascii="Clear Sans" w:hAnsi="Clear Sans"/>
+          <w:color w:val="1F2933"/>
+          <w:kern w:val="0"/>
+          <w:sz w:val="21"/>
+          <w:szCs w:val="21"/>
+        </w:rPr>
+        <w:t xml:space="preserve">No Teachers Pay Teachers or other sites. (If you have a research partner, find one task together.) Be ready to pose it in the clinic.</w:t>
       </w:r>
     </w:p>
     <w:p>

</xml_diff>

<commit_message>
Week 8 rich task handout: Van de Walle listed without Canvas links
Co-Authored-By: Claude Opus 5.5 <noreply@anthropic.com>
</commit_message>
<xml_diff>
--- a/week-8-rich-tasks/week-8-rich-task.docx
+++ b/week-8-rich-tasks/week-8-rich-task.docx
@@ -680,54 +680,8 @@
           <w:sz w:val="21"/>
           <w:szCs w:val="21"/>
         </w:rPr>
-        <w:t xml:space="preserve">Van de Walle, chapters 3 and 4 in Canvas (Hamilton): </w:t>
+        <w:t xml:space="preserve">Van de Walle</w:t>
       </w:r>
-      <w:hyperlink r:id="rId102">
-        <w:r>
-          <w:rPr>
-            <w:rFonts w:eastAsia="ＭＳ 明朝" w:cs="Calibri" w:ascii="Clear Sans" w:hAnsi="Clear Sans"/>
-            <w:color w:val="0563C1"/>
-            <w:kern w:val="0"/>
-            <w:sz w:val="21"/>
-            <w:szCs w:val="21"/>
-            <w:u w:val="single"/>
-          </w:rPr>
-          <w:t>https://miamioh.instructure.com/courses/258364/files/folder/van%20de%20Walle%20Readings</w:t>
-        </w:r>
-      </w:hyperlink>
-      <w:r>
-        <w:rPr>
-          <w:rFonts w:eastAsia="ＭＳ 明朝" w:cs="Calibri" w:ascii="Clear Sans" w:hAnsi="Clear Sans"/>
-          <w:color w:val="1F2933"/>
-          <w:kern w:val="0"/>
-          <w:sz w:val="21"/>
-          <w:szCs w:val="21"/>
-        </w:rPr>
-        <w:br/>
-      </w:r>
-      <w:r>
-        <w:rPr>
-          <w:rFonts w:eastAsia="ＭＳ 明朝" w:cs="Calibri" w:ascii="Clear Sans" w:hAnsi="Clear Sans"/>
-          <w:color w:val="1F2933"/>
-          <w:kern w:val="0"/>
-          <w:sz w:val="21"/>
-          <w:szCs w:val="21"/>
-        </w:rPr>
-        <w:t xml:space="preserve">Van de Walle, chapters 3 and 4 in Canvas (Oxford): </w:t>
-      </w:r>
-      <w:hyperlink r:id="rId103">
-        <w:r>
-          <w:rPr>
-            <w:rFonts w:eastAsia="ＭＳ 明朝" w:cs="Calibri" w:ascii="Clear Sans" w:hAnsi="Clear Sans"/>
-            <w:color w:val="0563C1"/>
-            <w:kern w:val="0"/>
-            <w:sz w:val="21"/>
-            <w:szCs w:val="21"/>
-            <w:u w:val="single"/>
-          </w:rPr>
-          <w:t>https://miamioh.instructure.com/courses/258372/files/folder/van%20de%20Walle%20Readings</w:t>
-        </w:r>
-      </w:hyperlink>
       <w:r>
         <w:rPr>
           <w:rFonts w:eastAsia="ＭＳ 明朝" w:cs="Calibri" w:ascii="Clear Sans" w:hAnsi="Clear Sans"/>

</xml_diff>

<commit_message>
Weeks 8-10: drop research partners; each tester line says they test, not build
Co-Authored-By: Claude Opus 5.5 <noreply@anthropic.com>
</commit_message>
<xml_diff>
--- a/week-8-rich-tasks/week-8-rich-task.docx
+++ b/week-8-rich-tasks/week-8-rich-task.docx
@@ -733,7 +733,7 @@
           <w:sz w:val="21"/>
           <w:szCs w:val="21"/>
         </w:rPr>
-        <w:t xml:space="preserve">No Teachers Pay Teachers or other sites. (If you have a research partner, find one task together.) Be ready to pose it in the clinic.</w:t>
+        <w:t xml:space="preserve">No Teachers Pay Teachers or other sites. Be ready to pose it in the clinic.</w:t>
       </w:r>
     </w:p>
     <w:p>
@@ -1185,7 +1185,7 @@
           <w:sz w:val="21"/>
           <w:szCs w:val="21"/>
         </w:rPr>
-        <w:t xml:space="preserve">If you have a research partner, the two of you design and defend the task together. Your Task Tester is a different person — the one who tests it, not builds it.</w:t>
+        <w:t xml:space="preserve">Your Task Tester tests your task; they don't help build it.</w:t>
       </w:r>
     </w:p>
     <w:p>

</xml_diff>

<commit_message>
Weeks 8-9: one document in two parts, your own PDF; Week 8 says which AI buttons to use
Co-Authored-By: Claude Opus 5.5 <noreply@anthropic.com>
</commit_message>
<xml_diff>
--- a/week-8-rich-tasks/week-8-rich-task.docx
+++ b/week-8-rich-tasks/week-8-rich-task.docx
@@ -923,6 +923,19 @@
         </w:rPr>
         <w:t xml:space="preserve"> Read what it says, and note what it surfaced.</w:t>
       </w:r>
+      <w:r>
+        <w:rPr>
+          <w:rFonts w:eastAsia="ＭＳ 明朝" w:cs="Calibri" w:ascii="Clear Sans" w:hAnsi="Clear Sans"/>
+          <w:b/>
+          <w:bCs/>
+          <w:color w:val="1F2933"/>
+          <w:kern w:val="0"/>
+          <w:sz w:val="21"/>
+          <w:szCs w:val="21"/>
+          <w:shd w:fill="FFFF00" w:val="clear"/>
+        </w:rPr>
+        <w:t xml:space="preserve"> Ask me is optional. Skip Show me options this week: you're testing your task, not looking for a new one.</w:t>
+      </w:r>
     </w:p>
     <w:p>
       <w:pPr>
@@ -1014,7 +1027,7 @@
           <w:sz w:val="21"/>
           <w:szCs w:val="21"/>
         </w:rPr>
-        <w:t>Two documents, submitted in Canvas as a single (combined) PDF or two separate PDFs:</w:t>
+        <w:t>One document in two parts, submitted in Canvas as a single PDF. Create your own PDF in Word or Google Docs.</w:t>
       </w:r>
     </w:p>
     <w:p>
@@ -1044,7 +1057,7 @@
           <w:sz w:val="21"/>
           <w:szCs w:val="21"/>
         </w:rPr>
-        <w:t>Document 1:</w:t>
+        <w:t>Part 1:</w:t>
       </w:r>
       <w:r>
         <w:rPr>
@@ -1084,7 +1097,7 @@
           <w:sz w:val="21"/>
           <w:szCs w:val="21"/>
         </w:rPr>
-        <w:t xml:space="preserve">Document 2:</w:t>
+        <w:t xml:space="preserve">Part 2:</w:t>
       </w:r>
       <w:r>
         <w:rPr>
@@ -1699,7 +1712,7 @@
                 <w:sz w:val="21"/>
                 <w:szCs w:val="21"/>
               </w:rPr>
-              <w:t>Evidence you tested with a human first, then with the genAI planning partner, and revised critically — not blindly — from both. What you changed, what you rejected, and why. This is Document 2.</w:t>
+              <w:t>Evidence you tested with a human first, then with the genAI planning partner, and revised critically — not blindly — from both. What you changed, what you rejected, and why. This is Part 2.</w:t>
             </w:r>
           </w:p>
         </w:tc>

</xml_diff>

<commit_message>
Week 8 rich task: updated handout
Co-Authored-By: Claude Opus 5.5 <noreply@anthropic.com>
</commit_message>
<xml_diff>
--- a/week-8-rich-tasks/week-8-rich-task.docx
+++ b/week-8-rich-tasks/week-8-rich-task.docx
@@ -605,20 +605,12 @@
           <w:szCs w:val="21"/>
         </w:rPr>
         <w:br/>
-      </w:r>
-      <w:r>
-        <w:rPr>
-          <w:rFonts w:eastAsia="ＭＳ 明朝" w:cs="Calibri" w:ascii="Clear Sans" w:hAnsi="Clear Sans"/>
-          <w:color w:val="1F2933"/>
-          <w:kern w:val="0"/>
-          <w:sz w:val="21"/>
-          <w:szCs w:val="21"/>
-        </w:rPr>
         <w:t xml:space="preserve">NRICH: </w:t>
       </w:r>
-      <w:hyperlink r:id="rId100">
+      <w:hyperlink r:id="rId2">
         <w:r>
           <w:rPr>
+            <w:rStyle w:val="ListLabel64"/>
             <w:rFonts w:eastAsia="ＭＳ 明朝" w:cs="Calibri" w:ascii="Clear Sans" w:hAnsi="Clear Sans"/>
             <w:color w:val="0563C1"/>
             <w:kern w:val="0"/>
@@ -638,20 +630,12 @@
           <w:szCs w:val="21"/>
         </w:rPr>
         <w:br/>
-      </w:r>
-      <w:r>
-        <w:rPr>
-          <w:rFonts w:eastAsia="ＭＳ 明朝" w:cs="Calibri" w:ascii="Clear Sans" w:hAnsi="Clear Sans"/>
-          <w:color w:val="1F2933"/>
-          <w:kern w:val="0"/>
-          <w:sz w:val="21"/>
-          <w:szCs w:val="21"/>
-        </w:rPr>
         <w:t xml:space="preserve">YouCubed: </w:t>
       </w:r>
-      <w:hyperlink r:id="rId101">
+      <w:hyperlink r:id="rId3">
         <w:r>
           <w:rPr>
+            <w:rStyle w:val="ListLabel64"/>
             <w:rFonts w:eastAsia="ＭＳ 明朝" w:cs="Calibri" w:ascii="Clear Sans" w:hAnsi="Clear Sans"/>
             <w:color w:val="0563C1"/>
             <w:kern w:val="0"/>
@@ -671,40 +655,14 @@
           <w:szCs w:val="21"/>
         </w:rPr>
         <w:br/>
-      </w:r>
-      <w:r>
-        <w:rPr>
-          <w:rFonts w:eastAsia="ＭＳ 明朝" w:cs="Calibri" w:ascii="Clear Sans" w:hAnsi="Clear Sans"/>
-          <w:color w:val="1F2933"/>
-          <w:kern w:val="0"/>
-          <w:sz w:val="21"/>
-          <w:szCs w:val="21"/>
-        </w:rPr>
-        <w:t xml:space="preserve">Van de Walle</w:t>
-      </w:r>
-      <w:r>
-        <w:rPr>
-          <w:rFonts w:eastAsia="ＭＳ 明朝" w:cs="Calibri" w:ascii="Clear Sans" w:hAnsi="Clear Sans"/>
-          <w:color w:val="1F2933"/>
-          <w:kern w:val="0"/>
-          <w:sz w:val="21"/>
-          <w:szCs w:val="21"/>
-        </w:rPr>
+        <w:t>Van de Walle</w:t>
         <w:br/>
-      </w:r>
-      <w:r>
-        <w:rPr>
-          <w:rFonts w:eastAsia="ＭＳ 明朝" w:cs="Calibri" w:ascii="Clear Sans" w:hAnsi="Clear Sans"/>
-          <w:color w:val="1F2933"/>
-          <w:kern w:val="0"/>
-          <w:sz w:val="21"/>
-          <w:szCs w:val="21"/>
-        </w:rPr>
         <w:t xml:space="preserve">JSTOR, articles from journals like Teaching Children Mathematics: </w:t>
       </w:r>
-      <w:hyperlink r:id="rId104">
+      <w:hyperlink r:id="rId4">
         <w:r>
           <w:rPr>
+            <w:rStyle w:val="ListLabel64"/>
             <w:rFonts w:eastAsia="ＭＳ 明朝" w:cs="Calibri" w:ascii="Clear Sans" w:hAnsi="Clear Sans"/>
             <w:color w:val="0563C1"/>
             <w:kern w:val="0"/>
@@ -724,16 +682,7 @@
           <w:szCs w:val="21"/>
         </w:rPr>
         <w:br/>
-      </w:r>
-      <w:r>
-        <w:rPr>
-          <w:rFonts w:eastAsia="ＭＳ 明朝" w:cs="Calibri" w:ascii="Clear Sans" w:hAnsi="Clear Sans"/>
-          <w:color w:val="1F2933"/>
-          <w:kern w:val="0"/>
-          <w:sz w:val="21"/>
-          <w:szCs w:val="21"/>
-        </w:rPr>
-        <w:t xml:space="preserve">No Teachers Pay Teachers or other sites. Be ready to pose it in the clinic.</w:t>
+        <w:t>No Teachers Pay Teachers or other sites. Be ready to pose it in the clinic.</w:t>
       </w:r>
     </w:p>
     <w:p>
@@ -785,7 +734,7 @@
           <w:sz w:val="21"/>
           <w:szCs w:val="21"/>
         </w:rPr>
-        <w:t xml:space="preserve">Your Task Tester is the person next to you in class, someone who has not seen your task. Pose it, and let them explore it while you watch. They don’t need to finish: the goal is to find out whether the task is rich, not to get the answer. Do not rescue or hint. Photograph their work; you will need it.</w:t>
+        <w:t>Your Task Tester is the person next to you in class, someone who has not seen your task. Pose it, and let them explore it while you watch. They don’t need to finish: the goal is to find out whether the task is rich, not to get the answer. Do not rescue or hint. Photograph their work; you will need it.</w:t>
       </w:r>
     </w:p>
     <w:p>
@@ -826,7 +775,7 @@
           <w:szCs w:val="21"/>
           <w:shd w:fill="FFFF00" w:val="clear"/>
         </w:rPr>
-        <w:t xml:space="preserve">Ask your Task Tester: is the task</w:t>
+        <w:t>Ask your Task Tester: is the task</w:t>
       </w:r>
       <w:r>
         <w:rPr>
@@ -876,71 +825,35 @@
           <w:sz w:val="21"/>
           <w:szCs w:val="21"/>
         </w:rPr>
-        <w:t xml:space="preserve">Then type your task into the BDA Planner (Plan → During) and press Check this. It already has your grade and your research question.</w:t>
+        <w:t>Then type your task into the BDA Planner (Plan → During) and press Check this. It already has your grade and your research question. Read what it says, and note what it surfaced.</w:t>
       </w:r>
-      <w:r>
+    </w:p>
+    <w:p>
+      <w:pPr>
+        <w:pStyle w:val="Normal"/>
+        <w:spacing w:lineRule="auto" w:line="240" w:before="86" w:after="86"/>
+        <w:jc w:val="left"/>
         <w:rPr>
-          <w:rFonts w:eastAsia="ＭＳ 明朝" w:cs="Calibri" w:ascii="Clear Sans" w:hAnsi="Clear Sans"/>
-          <w:b/>
-          <w:bCs/>
-          <w:color w:val="1F2933"/>
-          <w:kern w:val="0"/>
-          <w:sz w:val="21"/>
-          <w:szCs w:val="21"/>
-          <w:shd w:fill="FFFF00" w:val="clear"/>
-        </w:rPr>
-        <w:t xml:space="preserve"/>
-      </w:r>
-      <w:r>
-        <w:rPr>
-          <w:rFonts w:eastAsia="ＭＳ 明朝" w:cs="Calibri" w:ascii="Clear Sans" w:hAnsi="Clear Sans"/>
-          <w:color w:val="1F2933"/>
-          <w:kern w:val="0"/>
+          <w:rFonts w:ascii="Clear Sans" w:hAnsi="Clear Sans"/>
           <w:sz w:val="21"/>
           <w:szCs w:val="21"/>
         </w:rPr>
-        <w:t xml:space="preserve"/>
-      </w:r>
+      </w:pPr>
       <w:r>
         <w:rPr>
-          <w:rFonts w:eastAsia="ＭＳ 明朝" w:cs="Calibri" w:ascii="Clear Sans" w:hAnsi="Clear Sans"/>
-          <w:i/>
-          <w:iCs/>
-          <w:color w:val="1F2933"/>
-          <w:kern w:val="0"/>
+          <w:rFonts w:ascii="Clear Sans" w:hAnsi="Clear Sans"/>
           <w:sz w:val="21"/>
           <w:szCs w:val="21"/>
         </w:rPr>
-        <w:t xml:space="preserve"/>
       </w:r>
       <w:r>
-        <w:rPr>
-          <w:rFonts w:eastAsia="ＭＳ 明朝" w:cs="Calibri" w:ascii="Clear Sans" w:hAnsi="Clear Sans"/>
-          <w:color w:val="1F2933"/>
-          <w:kern w:val="0"/>
-          <w:sz w:val="21"/>
-          <w:szCs w:val="21"/>
-        </w:rPr>
-        <w:t xml:space="preserve"> Read what it says, and note what it surfaced.</w:t>
-      </w:r>
-      <w:r>
-        <w:rPr>
-          <w:rFonts w:eastAsia="ＭＳ 明朝" w:cs="Calibri" w:ascii="Clear Sans" w:hAnsi="Clear Sans"/>
-          <w:b/>
-          <w:bCs/>
-          <w:color w:val="1F2933"/>
-          <w:kern w:val="0"/>
-          <w:sz w:val="21"/>
-          <w:szCs w:val="21"/>
-          <w:shd w:fill="FFFF00" w:val="clear"/>
-        </w:rPr>
-        <w:t xml:space="preserve"> Ask me is optional. Skip Show me options this week: you're testing your task, not looking for a new one.</w:t>
+        <w:br w:type="page"/>
       </w:r>
     </w:p>
     <w:p>
       <w:pPr>
         <w:pStyle w:val="Normal"/>
-        <w:spacing w:lineRule="auto" w:line="240" w:before="86" w:after="86"/>
+        <w:spacing w:lineRule="auto" w:line="240" w:before="0" w:after="86"/>
         <w:jc w:val="left"/>
         <w:rPr>
           <w:rFonts w:ascii="Clear Sans" w:hAnsi="Clear Sans"/>
@@ -980,7 +893,7 @@
           <w:sz w:val="21"/>
           <w:szCs w:val="21"/>
         </w:rPr>
-        <w:t xml:space="preserve">Revise your task in light of both reads — your Task Tester’s work and feedback, and the genAI planning partner's check. In a paragraph, discuss how each improved the task, with specifics.</w:t>
+        <w:t>Revise your task in light of both reads — your Task Tester’s work and feedback, and the genAI planning partner's check. In a paragraph, discuss how each improved the task, with specifics.</w:t>
       </w:r>
     </w:p>
     <w:p>
@@ -1027,7 +940,7 @@
           <w:sz w:val="21"/>
           <w:szCs w:val="21"/>
         </w:rPr>
-        <w:t>One document in two parts, submitted in Canvas as a single PDF. Create your own PDF in Word or Google Docs.</w:t>
+        <w:t>Two documents, submitted in Canvas as a single (combined) PDF or two separate PDFs:</w:t>
       </w:r>
     </w:p>
     <w:p>
@@ -1057,7 +970,7 @@
           <w:sz w:val="21"/>
           <w:szCs w:val="21"/>
         </w:rPr>
-        <w:t>Part 1:</w:t>
+        <w:t>Document 1:</w:t>
       </w:r>
       <w:r>
         <w:rPr>
@@ -1097,7 +1010,7 @@
           <w:sz w:val="21"/>
           <w:szCs w:val="21"/>
         </w:rPr>
-        <w:t xml:space="preserve">Part 2:</w:t>
+        <w:t>Document 2:</w:t>
       </w:r>
       <w:r>
         <w:rPr>
@@ -1198,7 +1111,7 @@
           <w:sz w:val="21"/>
           <w:szCs w:val="21"/>
         </w:rPr>
-        <w:t xml:space="preserve">Your Task Tester tests your task; they don't help build it.</w:t>
+        <w:t>Your Task Tester tests your task; they don't help build it.</w:t>
       </w:r>
     </w:p>
     <w:p>
@@ -1227,7 +1140,7 @@
           <w:sz w:val="21"/>
           <w:szCs w:val="21"/>
         </w:rPr>
-        <w:t xml:space="preserve">Human first:</w:t>
+        <w:t>Human first:</w:t>
       </w:r>
       <w:r>
         <w:rPr>
@@ -1321,7 +1234,7 @@
       </w:tblPr>
       <w:tblGrid>
         <w:gridCol w:w="1800"/>
-        <w:gridCol w:w="8820"/>
+        <w:gridCol w:w="8819"/>
       </w:tblGrid>
       <w:tr>
         <w:trPr/>
@@ -1360,7 +1273,7 @@
         </w:tc>
         <w:tc>
           <w:tcPr>
-            <w:tcW w:w="8820" w:type="dxa"/>
+            <w:tcW w:w="8819" w:type="dxa"/>
             <w:tcBorders/>
             <w:shd w:fill="CCCCCC" w:val="clear"/>
           </w:tcPr>
@@ -1428,7 +1341,7 @@
         </w:tc>
         <w:tc>
           <w:tcPr>
-            <w:tcW w:w="8820" w:type="dxa"/>
+            <w:tcW w:w="8819" w:type="dxa"/>
             <w:tcBorders/>
           </w:tcPr>
           <w:p>
@@ -1493,7 +1406,7 @@
         </w:tc>
         <w:tc>
           <w:tcPr>
-            <w:tcW w:w="8820" w:type="dxa"/>
+            <w:tcW w:w="8819" w:type="dxa"/>
             <w:tcBorders/>
           </w:tcPr>
           <w:p>
@@ -1558,7 +1471,7 @@
         </w:tc>
         <w:tc>
           <w:tcPr>
-            <w:tcW w:w="8820" w:type="dxa"/>
+            <w:tcW w:w="8819" w:type="dxa"/>
             <w:tcBorders/>
           </w:tcPr>
           <w:p>
@@ -1582,7 +1495,7 @@
                 <w:sz w:val="21"/>
                 <w:szCs w:val="21"/>
               </w:rPr>
-              <w:t xml:space="preserve">Three genuinely distinct solution strategies — surfaced by your Task Tester and any published solutions or notes — different in method or representation, not the same procedure three ways. The test of richness.</w:t>
+              <w:t>Three genuinely distinct solution strategies — surfaced by your Task Tester and any published solutions or notes — different in method or representation, not the same procedure three ways. The test of richness.</w:t>
             </w:r>
           </w:p>
         </w:tc>
@@ -1623,7 +1536,7 @@
         </w:tc>
         <w:tc>
           <w:tcPr>
-            <w:tcW w:w="8820" w:type="dxa"/>
+            <w:tcW w:w="8819" w:type="dxa"/>
             <w:tcBorders/>
           </w:tcPr>
           <w:p>
@@ -1688,7 +1601,7 @@
         </w:tc>
         <w:tc>
           <w:tcPr>
-            <w:tcW w:w="8820" w:type="dxa"/>
+            <w:tcW w:w="8819" w:type="dxa"/>
             <w:tcBorders/>
           </w:tcPr>
           <w:p>
@@ -1712,7 +1625,7 @@
                 <w:sz w:val="21"/>
                 <w:szCs w:val="21"/>
               </w:rPr>
-              <w:t>Evidence you tested with a human first, then with the genAI planning partner, and revised critically — not blindly — from both. What you changed, what you rejected, and why. This is Part 2.</w:t>
+              <w:t>Evidence you tested with a human first, then with the genAI planning partner, and revised critically — not blindly — from both. What you changed, what you rejected, and why. This is Document 2.</w:t>
             </w:r>
           </w:p>
         </w:tc>
@@ -1735,9 +1648,12 @@
       </w:pPr>
       <w:r>
         <w:rPr>
-          <w:rFonts w:ascii="Clear Sans" w:hAnsi="Clear Sans"/>
-          <w:sz w:val="21"/>
-          <w:szCs w:val="21"/>
+          <w:rFonts w:cs="Calibri"/>
+          <w:b/>
+          <w:bCs/>
+          <w:i/>
+          <w:iCs/>
+          <w:kern w:val="0"/>
         </w:rPr>
       </w:r>
     </w:p>
@@ -3357,6 +3273,13 @@
       <w:bCs/>
       <w:smallCaps/>
       <w:spacing w:val="5"/>
+    </w:rPr>
+  </w:style>
+  <w:style w:type="character" w:styleId="Hyperlink">
+    <w:name w:val="Hyperlink"/>
+    <w:rPr>
+      <w:color w:val="000080"/>
+      <w:u w:val="single"/>
     </w:rPr>
   </w:style>
   <w:style w:type="paragraph" w:styleId="Heading">

</xml_diff>

<commit_message>
Week 8 rich task: restore one-document handout
The previous upload replaced the handout with an older copy that still
asked for Document 1 and Document 2. This restores the one-document,
two-part version (single PDF).

Co-Authored-By: Claude Opus 5.5 <noreply@anthropic.com>
Claude-Session: https://claude.ai/code/session_01Q7eYUm5DabG19U79JFryLU
</commit_message>
<xml_diff>
--- a/week-8-rich-tasks/week-8-rich-task.docx
+++ b/week-8-rich-tasks/week-8-rich-task.docx
@@ -605,12 +605,20 @@
           <w:szCs w:val="21"/>
         </w:rPr>
         <w:br/>
+      </w:r>
+      <w:r>
+        <w:rPr>
+          <w:rFonts w:eastAsia="ＭＳ 明朝" w:cs="Calibri" w:ascii="Clear Sans" w:hAnsi="Clear Sans"/>
+          <w:color w:val="1F2933"/>
+          <w:kern w:val="0"/>
+          <w:sz w:val="21"/>
+          <w:szCs w:val="21"/>
+        </w:rPr>
         <w:t xml:space="preserve">NRICH: </w:t>
       </w:r>
-      <w:hyperlink r:id="rId2">
+      <w:hyperlink r:id="rId100">
         <w:r>
           <w:rPr>
-            <w:rStyle w:val="ListLabel64"/>
             <w:rFonts w:eastAsia="ＭＳ 明朝" w:cs="Calibri" w:ascii="Clear Sans" w:hAnsi="Clear Sans"/>
             <w:color w:val="0563C1"/>
             <w:kern w:val="0"/>
@@ -630,12 +638,20 @@
           <w:szCs w:val="21"/>
         </w:rPr>
         <w:br/>
+      </w:r>
+      <w:r>
+        <w:rPr>
+          <w:rFonts w:eastAsia="ＭＳ 明朝" w:cs="Calibri" w:ascii="Clear Sans" w:hAnsi="Clear Sans"/>
+          <w:color w:val="1F2933"/>
+          <w:kern w:val="0"/>
+          <w:sz w:val="21"/>
+          <w:szCs w:val="21"/>
+        </w:rPr>
         <w:t xml:space="preserve">YouCubed: </w:t>
       </w:r>
-      <w:hyperlink r:id="rId3">
+      <w:hyperlink r:id="rId101">
         <w:r>
           <w:rPr>
-            <w:rStyle w:val="ListLabel64"/>
             <w:rFonts w:eastAsia="ＭＳ 明朝" w:cs="Calibri" w:ascii="Clear Sans" w:hAnsi="Clear Sans"/>
             <w:color w:val="0563C1"/>
             <w:kern w:val="0"/>
@@ -655,14 +671,40 @@
           <w:szCs w:val="21"/>
         </w:rPr>
         <w:br/>
-        <w:t>Van de Walle</w:t>
+      </w:r>
+      <w:r>
+        <w:rPr>
+          <w:rFonts w:eastAsia="ＭＳ 明朝" w:cs="Calibri" w:ascii="Clear Sans" w:hAnsi="Clear Sans"/>
+          <w:color w:val="1F2933"/>
+          <w:kern w:val="0"/>
+          <w:sz w:val="21"/>
+          <w:szCs w:val="21"/>
+        </w:rPr>
+        <w:t xml:space="preserve">Van de Walle</w:t>
+      </w:r>
+      <w:r>
+        <w:rPr>
+          <w:rFonts w:eastAsia="ＭＳ 明朝" w:cs="Calibri" w:ascii="Clear Sans" w:hAnsi="Clear Sans"/>
+          <w:color w:val="1F2933"/>
+          <w:kern w:val="0"/>
+          <w:sz w:val="21"/>
+          <w:szCs w:val="21"/>
+        </w:rPr>
         <w:br/>
+      </w:r>
+      <w:r>
+        <w:rPr>
+          <w:rFonts w:eastAsia="ＭＳ 明朝" w:cs="Calibri" w:ascii="Clear Sans" w:hAnsi="Clear Sans"/>
+          <w:color w:val="1F2933"/>
+          <w:kern w:val="0"/>
+          <w:sz w:val="21"/>
+          <w:szCs w:val="21"/>
+        </w:rPr>
         <w:t xml:space="preserve">JSTOR, articles from journals like Teaching Children Mathematics: </w:t>
       </w:r>
-      <w:hyperlink r:id="rId4">
+      <w:hyperlink r:id="rId104">
         <w:r>
           <w:rPr>
-            <w:rStyle w:val="ListLabel64"/>
             <w:rFonts w:eastAsia="ＭＳ 明朝" w:cs="Calibri" w:ascii="Clear Sans" w:hAnsi="Clear Sans"/>
             <w:color w:val="0563C1"/>
             <w:kern w:val="0"/>
@@ -682,7 +724,16 @@
           <w:szCs w:val="21"/>
         </w:rPr>
         <w:br/>
-        <w:t>No Teachers Pay Teachers or other sites. Be ready to pose it in the clinic.</w:t>
+      </w:r>
+      <w:r>
+        <w:rPr>
+          <w:rFonts w:eastAsia="ＭＳ 明朝" w:cs="Calibri" w:ascii="Clear Sans" w:hAnsi="Clear Sans"/>
+          <w:color w:val="1F2933"/>
+          <w:kern w:val="0"/>
+          <w:sz w:val="21"/>
+          <w:szCs w:val="21"/>
+        </w:rPr>
+        <w:t xml:space="preserve">No Teachers Pay Teachers or other sites. Be ready to pose it in the clinic.</w:t>
       </w:r>
     </w:p>
     <w:p>
@@ -734,7 +785,7 @@
           <w:sz w:val="21"/>
           <w:szCs w:val="21"/>
         </w:rPr>
-        <w:t>Your Task Tester is the person next to you in class, someone who has not seen your task. Pose it, and let them explore it while you watch. They don’t need to finish: the goal is to find out whether the task is rich, not to get the answer. Do not rescue or hint. Photograph their work; you will need it.</w:t>
+        <w:t xml:space="preserve">Your Task Tester is the person next to you in class, someone who has not seen your task. Pose it, and let them explore it while you watch. They don’t need to finish: the goal is to find out whether the task is rich, not to get the answer. Do not rescue or hint. Photograph their work; you will need it.</w:t>
       </w:r>
     </w:p>
     <w:p>
@@ -775,7 +826,7 @@
           <w:szCs w:val="21"/>
           <w:shd w:fill="FFFF00" w:val="clear"/>
         </w:rPr>
-        <w:t>Ask your Task Tester: is the task</w:t>
+        <w:t xml:space="preserve">Ask your Task Tester: is the task</w:t>
       </w:r>
       <w:r>
         <w:rPr>
@@ -825,35 +876,71 @@
           <w:sz w:val="21"/>
           <w:szCs w:val="21"/>
         </w:rPr>
-        <w:t>Then type your task into the BDA Planner (Plan → During) and press Check this. It already has your grade and your research question. Read what it says, and note what it surfaced.</w:t>
+        <w:t xml:space="preserve">Then type your task into the BDA Planner (Plan → During) and press Check this. It already has your grade and your research question.</w:t>
+      </w:r>
+      <w:r>
+        <w:rPr>
+          <w:rFonts w:eastAsia="ＭＳ 明朝" w:cs="Calibri" w:ascii="Clear Sans" w:hAnsi="Clear Sans"/>
+          <w:b/>
+          <w:bCs/>
+          <w:color w:val="1F2933"/>
+          <w:kern w:val="0"/>
+          <w:sz w:val="21"/>
+          <w:szCs w:val="21"/>
+          <w:shd w:fill="FFFF00" w:val="clear"/>
+        </w:rPr>
+        <w:t xml:space="preserve"/>
+      </w:r>
+      <w:r>
+        <w:rPr>
+          <w:rFonts w:eastAsia="ＭＳ 明朝" w:cs="Calibri" w:ascii="Clear Sans" w:hAnsi="Clear Sans"/>
+          <w:color w:val="1F2933"/>
+          <w:kern w:val="0"/>
+          <w:sz w:val="21"/>
+          <w:szCs w:val="21"/>
+        </w:rPr>
+        <w:t xml:space="preserve"/>
+      </w:r>
+      <w:r>
+        <w:rPr>
+          <w:rFonts w:eastAsia="ＭＳ 明朝" w:cs="Calibri" w:ascii="Clear Sans" w:hAnsi="Clear Sans"/>
+          <w:i/>
+          <w:iCs/>
+          <w:color w:val="1F2933"/>
+          <w:kern w:val="0"/>
+          <w:sz w:val="21"/>
+          <w:szCs w:val="21"/>
+        </w:rPr>
+        <w:t xml:space="preserve"/>
+      </w:r>
+      <w:r>
+        <w:rPr>
+          <w:rFonts w:eastAsia="ＭＳ 明朝" w:cs="Calibri" w:ascii="Clear Sans" w:hAnsi="Clear Sans"/>
+          <w:color w:val="1F2933"/>
+          <w:kern w:val="0"/>
+          <w:sz w:val="21"/>
+          <w:szCs w:val="21"/>
+        </w:rPr>
+        <w:t xml:space="preserve"> Read what it says, and note what it surfaced.</w:t>
+      </w:r>
+      <w:r>
+        <w:rPr>
+          <w:rFonts w:eastAsia="ＭＳ 明朝" w:cs="Calibri" w:ascii="Clear Sans" w:hAnsi="Clear Sans"/>
+          <w:b/>
+          <w:bCs/>
+          <w:color w:val="1F2933"/>
+          <w:kern w:val="0"/>
+          <w:sz w:val="21"/>
+          <w:szCs w:val="21"/>
+          <w:shd w:fill="FFFF00" w:val="clear"/>
+        </w:rPr>
+        <w:t xml:space="preserve"> Ask me is optional. Skip Show me options this week: you're testing your task, not looking for a new one.</w:t>
       </w:r>
     </w:p>
     <w:p>
       <w:pPr>
         <w:pStyle w:val="Normal"/>
         <w:spacing w:lineRule="auto" w:line="240" w:before="86" w:after="86"/>
-        <w:jc w:val="left"/>
-        <w:rPr>
-          <w:rFonts w:ascii="Clear Sans" w:hAnsi="Clear Sans"/>
-          <w:sz w:val="21"/>
-          <w:szCs w:val="21"/>
-        </w:rPr>
-      </w:pPr>
-      <w:r>
-        <w:rPr>
-          <w:rFonts w:ascii="Clear Sans" w:hAnsi="Clear Sans"/>
-          <w:sz w:val="21"/>
-          <w:szCs w:val="21"/>
-        </w:rPr>
-      </w:r>
-      <w:r>
-        <w:br w:type="page"/>
-      </w:r>
-    </w:p>
-    <w:p>
-      <w:pPr>
-        <w:pStyle w:val="Normal"/>
-        <w:spacing w:lineRule="auto" w:line="240" w:before="0" w:after="86"/>
         <w:jc w:val="left"/>
         <w:rPr>
           <w:rFonts w:ascii="Clear Sans" w:hAnsi="Clear Sans"/>
@@ -893,7 +980,7 @@
           <w:sz w:val="21"/>
           <w:szCs w:val="21"/>
         </w:rPr>
-        <w:t>Revise your task in light of both reads — your Task Tester’s work and feedback, and the genAI planning partner's check. In a paragraph, discuss how each improved the task, with specifics.</w:t>
+        <w:t xml:space="preserve">Revise your task in light of both reads — your Task Tester’s work and feedback, and the genAI planning partner's check. In a paragraph, discuss how each improved the task, with specifics.</w:t>
       </w:r>
     </w:p>
     <w:p>
@@ -940,7 +1027,7 @@
           <w:sz w:val="21"/>
           <w:szCs w:val="21"/>
         </w:rPr>
-        <w:t>Two documents, submitted in Canvas as a single (combined) PDF or two separate PDFs:</w:t>
+        <w:t>One document in two parts, submitted in Canvas as a single PDF. Create your own PDF in Word or Google Docs.</w:t>
       </w:r>
     </w:p>
     <w:p>
@@ -970,7 +1057,7 @@
           <w:sz w:val="21"/>
           <w:szCs w:val="21"/>
         </w:rPr>
-        <w:t>Document 1:</w:t>
+        <w:t>Part 1:</w:t>
       </w:r>
       <w:r>
         <w:rPr>
@@ -1010,7 +1097,7 @@
           <w:sz w:val="21"/>
           <w:szCs w:val="21"/>
         </w:rPr>
-        <w:t>Document 2:</w:t>
+        <w:t xml:space="preserve">Part 2:</w:t>
       </w:r>
       <w:r>
         <w:rPr>
@@ -1111,7 +1198,7 @@
           <w:sz w:val="21"/>
           <w:szCs w:val="21"/>
         </w:rPr>
-        <w:t>Your Task Tester tests your task; they don't help build it.</w:t>
+        <w:t xml:space="preserve">Your Task Tester tests your task; they don't help build it.</w:t>
       </w:r>
     </w:p>
     <w:p>
@@ -1140,7 +1227,7 @@
           <w:sz w:val="21"/>
           <w:szCs w:val="21"/>
         </w:rPr>
-        <w:t>Human first:</w:t>
+        <w:t xml:space="preserve">Human first:</w:t>
       </w:r>
       <w:r>
         <w:rPr>
@@ -1234,7 +1321,7 @@
       </w:tblPr>
       <w:tblGrid>
         <w:gridCol w:w="1800"/>
-        <w:gridCol w:w="8819"/>
+        <w:gridCol w:w="8820"/>
       </w:tblGrid>
       <w:tr>
         <w:trPr/>
@@ -1273,7 +1360,7 @@
         </w:tc>
         <w:tc>
           <w:tcPr>
-            <w:tcW w:w="8819" w:type="dxa"/>
+            <w:tcW w:w="8820" w:type="dxa"/>
             <w:tcBorders/>
             <w:shd w:fill="CCCCCC" w:val="clear"/>
           </w:tcPr>
@@ -1341,7 +1428,7 @@
         </w:tc>
         <w:tc>
           <w:tcPr>
-            <w:tcW w:w="8819" w:type="dxa"/>
+            <w:tcW w:w="8820" w:type="dxa"/>
             <w:tcBorders/>
           </w:tcPr>
           <w:p>
@@ -1406,7 +1493,7 @@
         </w:tc>
         <w:tc>
           <w:tcPr>
-            <w:tcW w:w="8819" w:type="dxa"/>
+            <w:tcW w:w="8820" w:type="dxa"/>
             <w:tcBorders/>
           </w:tcPr>
           <w:p>
@@ -1471,7 +1558,7 @@
         </w:tc>
         <w:tc>
           <w:tcPr>
-            <w:tcW w:w="8819" w:type="dxa"/>
+            <w:tcW w:w="8820" w:type="dxa"/>
             <w:tcBorders/>
           </w:tcPr>
           <w:p>
@@ -1495,7 +1582,7 @@
                 <w:sz w:val="21"/>
                 <w:szCs w:val="21"/>
               </w:rPr>
-              <w:t>Three genuinely distinct solution strategies — surfaced by your Task Tester and any published solutions or notes — different in method or representation, not the same procedure three ways. The test of richness.</w:t>
+              <w:t xml:space="preserve">Three genuinely distinct solution strategies — surfaced by your Task Tester and any published solutions or notes — different in method or representation, not the same procedure three ways. The test of richness.</w:t>
             </w:r>
           </w:p>
         </w:tc>
@@ -1536,7 +1623,7 @@
         </w:tc>
         <w:tc>
           <w:tcPr>
-            <w:tcW w:w="8819" w:type="dxa"/>
+            <w:tcW w:w="8820" w:type="dxa"/>
             <w:tcBorders/>
           </w:tcPr>
           <w:p>
@@ -1601,7 +1688,7 @@
         </w:tc>
         <w:tc>
           <w:tcPr>
-            <w:tcW w:w="8819" w:type="dxa"/>
+            <w:tcW w:w="8820" w:type="dxa"/>
             <w:tcBorders/>
           </w:tcPr>
           <w:p>
@@ -1625,7 +1712,7 @@
                 <w:sz w:val="21"/>
                 <w:szCs w:val="21"/>
               </w:rPr>
-              <w:t>Evidence you tested with a human first, then with the genAI planning partner, and revised critically — not blindly — from both. What you changed, what you rejected, and why. This is Document 2.</w:t>
+              <w:t>Evidence you tested with a human first, then with the genAI planning partner, and revised critically — not blindly — from both. What you changed, what you rejected, and why. This is Part 2.</w:t>
             </w:r>
           </w:p>
         </w:tc>
@@ -1648,12 +1735,9 @@
       </w:pPr>
       <w:r>
         <w:rPr>
-          <w:rFonts w:cs="Calibri"/>
-          <w:b/>
-          <w:bCs/>
-          <w:i/>
-          <w:iCs/>
-          <w:kern w:val="0"/>
+          <w:rFonts w:ascii="Clear Sans" w:hAnsi="Clear Sans"/>
+          <w:sz w:val="21"/>
+          <w:szCs w:val="21"/>
         </w:rPr>
       </w:r>
     </w:p>
@@ -3273,13 +3357,6 @@
       <w:bCs/>
       <w:smallCaps/>
       <w:spacing w:val="5"/>
-    </w:rPr>
-  </w:style>
-  <w:style w:type="character" w:styleId="Hyperlink">
-    <w:name w:val="Hyperlink"/>
-    <w:rPr>
-      <w:color w:val="000080"/>
-      <w:u w:val="single"/>
     </w:rPr>
   </w:style>
   <w:style w:type="paragraph" w:styleId="Heading">

</xml_diff>